<commit_message>
Spacing, rebuild, rename Yom Kippur
</commit_message>
<xml_diff>
--- a/Files/02 - Shemos/01 - Shemos/5783/Shemos 5783.docx
+++ b/Files/02 - Shemos/01 - Shemos/5783/Shemos 5783.docx
@@ -93,7 +93,7 @@
         <w:rPr>
           <w:rFonts w:ascii="Times New Roman" w:hAnsi="Times New Roman" w:cs="Times New Roman"/>
         </w:rPr>
-        <w:t xml:space="preserve"> in</w:t>
+        <w:t xml:space="preserve"> in </w:t>
       </w:r>
       <w:r>
         <w:rPr>
@@ -1256,7 +1256,7 @@
         <w:rPr>
           <w:rFonts w:ascii="Times New Roman" w:hAnsi="Times New Roman" w:cs="Times New Roman"/>
         </w:rPr>
-        <w:t xml:space="preserve"> - They raised, or gave birth to, sons who were</w:t>
+        <w:t xml:space="preserve"> - They raised, or gave birth to, sons who were </w:t>
       </w:r>
       <w:r>
         <w:rPr>
@@ -2109,7 +2109,7 @@
         <w:rPr>
           <w:rFonts w:ascii="Times New Roman" w:hAnsi="Times New Roman" w:cs="Times New Roman"/>
         </w:rPr>
-        <w:t xml:space="preserve"> this, what benefit was there to</w:t>
+        <w:t xml:space="preserve"> this, what benefit was there to </w:t>
       </w:r>
       <w:r>
         <w:rPr>

</xml_diff>